<commit_message>
cap nhat file quartus project 4 vga
</commit_message>
<xml_diff>
--- a/00_Project_Management/Roadmap.docx
+++ b/00_Project_Management/Roadmap.docx
@@ -1202,18 +1202,20 @@
           <w:p>
             <w:pPr>
               <w:jc w:val="left"/>
-            </w:pPr>
-            <w:r>
-              <w:rPr>
-                <w:rFonts w:ascii="Calibri" w:hAnsi="Calibri" w:eastAsia="Calibri" w:cs="Calibri"/>
-                <w:b w:val="0"/>
-                <w:bCs w:val="0"/>
-                <w:color w:val="000000"/>
-                <w:sz w:val="20"/>
-                <w:szCs w:val="20"/>
-              </w:rPr>
-              <w:t>Chưa bắt đầu</w:t>
-            </w:r>
+              <w:rPr>
+                <w:rFonts w:hint="default"/>
+                <w:lang w:val="en-US"/>
+              </w:rPr>
+            </w:pPr>
+            <w:r>
+              <w:rPr>
+                <w:rFonts w:hint="default"/>
+                <w:lang w:val="en-US"/>
+              </w:rPr>
+              <w:t>Doing</w:t>
+            </w:r>
+            <w:bookmarkStart w:id="0" w:name="_GoBack"/>
+            <w:bookmarkEnd w:id="0"/>
           </w:p>
         </w:tc>
       </w:tr>
@@ -2236,8 +2238,6 @@
               </w:rPr>
               <w:t>Doing</w:t>
             </w:r>
-            <w:bookmarkStart w:id="0" w:name="_GoBack"/>
-            <w:bookmarkEnd w:id="0"/>
           </w:p>
         </w:tc>
       </w:tr>

</xml_diff>